<commit_message>
Add the R1 second-read link and an unconditional Council opt-out to her reply
The opt-out carries no counter-argument, which is the only way an
opt-out is real, and the instruction on file is to delete the letters
rather than hold them if she declines.

R1 routes through her because a cold link from a stranger would not be
answered, so the message asks her directly not to discuss her reads with
the reader.

Co-Authored-By: Claude Opus 5 <noreply@anthropic.com>
Claude-Session: https://claude.ai/code/session_01W9UtE7X76spacWeSvBH7tv
</commit_message>
<xml_diff>
--- a/research/Blind_Recheck_Links_2026-08-09.docx
+++ b/research/Blind_Recheck_Links_2026-08-09.docx
@@ -112,6 +112,47 @@
               <w:spacing w:after="0"/>
             </w:pPr>
             <w:r>
+              <w:t xml:space="preserve">offered to Stacyann Young to forward to her attorney contact, 2026-08-09</w:t>
+            </w:r>
+          </w:p>
+        </w:tc>
+        <w:tc>
+          <w:tcPr>
+            <w:tcW w:w="3120" w:type="dxa"/>
+          </w:tcPr>
+          <w:p>
+            <w:pPr>
+              <w:spacing w:after="0"/>
+            </w:pPr>
+            <w:r>
+              <w:t xml:space="preserve">https://jrsstandard.com/recheck.html?k=llfmfn3rb2</w:t>
+            </w:r>
+          </w:p>
+        </w:tc>
+      </w:tr>
+      <w:tr>
+        <w:tc>
+          <w:tcPr>
+            <w:tcW w:w="3120" w:type="dxa"/>
+          </w:tcPr>
+          <w:p>
+            <w:pPr>
+              <w:spacing w:after="0"/>
+            </w:pPr>
+            <w:r>
+              <w:t xml:space="preserve">R2</w:t>
+            </w:r>
+          </w:p>
+        </w:tc>
+        <w:tc>
+          <w:tcPr>
+            <w:tcW w:w="3120" w:type="dxa"/>
+          </w:tcPr>
+          <w:p>
+            <w:pPr>
+              <w:spacing w:after="0"/>
+            </w:pPr>
+            <w:r>
               <w:rPr>
                 <w:i/>
               </w:rPr>
@@ -128,7 +169,7 @@
               <w:spacing w:after="0"/>
             </w:pPr>
             <w:r>
-              <w:t xml:space="preserve">https://jrsstandard.com/recheck.html?k=llfmfn3rb2</w:t>
+              <w:t xml:space="preserve">https://jrsstandard.com/recheck.html?k=swlck68d5b</w:t>
             </w:r>
           </w:p>
         </w:tc>
@@ -143,7 +184,7 @@
               <w:spacing w:after="0"/>
             </w:pPr>
             <w:r>
-              <w:t xml:space="preserve">R2</w:t>
+              <w:t xml:space="preserve">R3</w:t>
             </w:r>
           </w:p>
         </w:tc>
@@ -172,50 +213,6 @@
               <w:spacing w:after="0"/>
             </w:pPr>
             <w:r>
-              <w:t xml:space="preserve">https://jrsstandard.com/recheck.html?k=swlck68d5b</w:t>
-            </w:r>
-          </w:p>
-        </w:tc>
-      </w:tr>
-      <w:tr>
-        <w:tc>
-          <w:tcPr>
-            <w:tcW w:w="3120" w:type="dxa"/>
-          </w:tcPr>
-          <w:p>
-            <w:pPr>
-              <w:spacing w:after="0"/>
-            </w:pPr>
-            <w:r>
-              <w:t xml:space="preserve">R3</w:t>
-            </w:r>
-          </w:p>
-        </w:tc>
-        <w:tc>
-          <w:tcPr>
-            <w:tcW w:w="3120" w:type="dxa"/>
-          </w:tcPr>
-          <w:p>
-            <w:pPr>
-              <w:spacing w:after="0"/>
-            </w:pPr>
-            <w:r>
-              <w:rPr>
-                <w:i/>
-              </w:rPr>
-              <w:t xml:space="preserve">unassigned</w:t>
-            </w:r>
-          </w:p>
-        </w:tc>
-        <w:tc>
-          <w:tcPr>
-            <w:tcW w:w="3120" w:type="dxa"/>
-          </w:tcPr>
-          <w:p>
-            <w:pPr>
-              <w:spacing w:after="0"/>
-            </w:pPr>
-            <w:r>
               <w:t xml:space="preserve">https://jrsstandard.com/recheck.html?k=ra9rn80s5k</w:t>
             </w:r>
           </w:p>
@@ -234,6 +231,20 @@
       </w:pPr>
       <w:r>
         <w:t xml:space="preserve">Three rather than one because a single reader gives one agreement figure with no way to tell a disagreement from a misread, and because a reader can go quiet. Hand out one, and the other two exist if you need them.</w:t>
+      </w:r>
+    </w:p>
+    <w:p>
+      <w:pPr>
+        <w:spacing w:after="140"/>
+      </w:pPr>
+      <w:r>
+        <w:rPr>
+          <w:b/>
+        </w:rPr>
+        <w:t xml:space="preserve">R1 went to Stacyann Young to forward</w:t>
+      </w:r>
+      <w:r>
+        <w:t xml:space="preserve">, because she has the relationship with the reader and a cold link from a stranger would not be answered. That is a deliberate trade: it puts the packet one step from the person who knows the answers. The message asks her directly not to tell the reader how she read any of these cases. The link itself cannot leak them, because it does not contain them, but a conversation can.</w:t>
       </w:r>
     </w:p>
     <w:p>

</xml_diff>